<commit_message>
v16: fix Mermaid 10.x syntax errors
Mermaid 10.9.5 was flagging syntax errors. Mermaid 10.x is stricter
than older versions about HTML tags and unicode in node labels and
message text. Cleanups:

flowchart (§1):
- Removed <i>...</i> tags (mermaid 10.x rejects them in node labels)
- Replaced unicode … with ASCII ...
- Changed cylinder shape [(label)] to rectangle [label] for the OZ node
  (cylinder + multiline + parens trips the parser)
- Quoted edge labels via |...| syntax for parser stability
- Replaced -. label .-> with -.->|label| (edge-label form)

sequenceDiagram (§1):
- Replaced unicode ≥ with >=, ≤ with <=, Σ with sum_of_, em-dash — with -
- Removed the unused webauthn-verifier participant
- Simplified Note over message text (no unbalanced parens, no commas
  in actor list that look like delimiters)

Co-Authored-By: Claude Opus 4.7 (1M context) <noreply@anthropic.com>
</commit_message>
<xml_diff>
--- a/SDF_PROPOSAL.docx
+++ b/SDF_PROPOSAL.docx
@@ -912,7 +912,7 @@
         <w:rPr>
           <w:rStyle w:val="VerbatimChar"/>
         </w:rPr>
-        <w:t xml:space="preserve">        Seed["BIP-39 seed&lt;br/&gt;&lt;i&gt;paper, never digital&lt;/i&gt;"]</w:t>
+        <w:t xml:space="preserve">        Seed["BIP-39 seed&lt;br/&gt;(paper, never digital)"]</w:t>
       </w:r>
       <w:r>
         <w:br/>
@@ -921,7 +921,7 @@
         <w:rPr>
           <w:rStyle w:val="VerbatimChar"/>
         </w:rPr>
-        <w:t xml:space="preserve">        OS["owner_secret&lt;br/&gt;= HKDF(seed, …)"]</w:t>
+        <w:t xml:space="preserve">        OS["owner_secret&lt;br/&gt;= HKDF(seed, ...)"]</w:t>
       </w:r>
       <w:r>
         <w:br/>
@@ -930,7 +930,7 @@
         <w:rPr>
           <w:rStyle w:val="VerbatimChar"/>
         </w:rPr>
-        <w:t xml:space="preserve">        Prover["Noir/UltraHonk&lt;br/&gt;prover (bb.js WASM)"]</w:t>
+        <w:t xml:space="preserve">        Prover["Noir / UltraHonk prover&lt;br/&gt;(bb.js WASM)"]</w:t>
       </w:r>
       <w:r>
         <w:br/>
@@ -939,7 +939,7 @@
         <w:rPr>
           <w:rStyle w:val="VerbatimChar"/>
         </w:rPr>
-        <w:t xml:space="preserve">        Seed -. derived locally .-&gt; OS</w:t>
+        <w:t xml:space="preserve">        Seed -.-&gt;|derived locally| OS</w:t>
       </w:r>
       <w:r>
         <w:br/>
@@ -978,7 +978,7 @@
         <w:rPr>
           <w:rStyle w:val="VerbatimChar"/>
         </w:rPr>
-        <w:t xml:space="preserve">        Factory[g2c-factory]</w:t>
+        <w:t xml:space="preserve">        Factory["g2c-factory"]</w:t>
       </w:r>
       <w:r>
         <w:br/>
@@ -987,7 +987,7 @@
         <w:rPr>
           <w:rStyle w:val="VerbatimChar"/>
         </w:rPr>
-        <w:t xml:space="preserve">        SA[g2c-smart-account]</w:t>
+        <w:t xml:space="preserve">        SA["g2c-smart-account"]</w:t>
       </w:r>
       <w:r>
         <w:br/>
@@ -996,7 +996,7 @@
         <w:rPr>
           <w:rStyle w:val="VerbatimChar"/>
         </w:rPr>
-        <w:t xml:space="preserve">        Verifier[g2c-zk-recovery-verifier]</w:t>
+        <w:t xml:space="preserve">        Verifier["g2c-zk-recovery-verifier"]</w:t>
       </w:r>
       <w:r>
         <w:br/>
@@ -1005,7 +1005,7 @@
         <w:rPr>
           <w:rStyle w:val="VerbatimChar"/>
         </w:rPr>
-        <w:t xml:space="preserve">        Controller[g2c-recovery-controller]</w:t>
+        <w:t xml:space="preserve">        Controller["g2c-recovery-controller"]</w:t>
       </w:r>
       <w:r>
         <w:br/>
@@ -1014,7 +1014,7 @@
         <w:rPr>
           <w:rStyle w:val="VerbatimChar"/>
         </w:rPr>
-        <w:t xml:space="preserve">        Policy[g2c-recovery-guard-policy]</w:t>
+        <w:t xml:space="preserve">        Policy["g2c-recovery-guard-policy"]</w:t>
       </w:r>
       <w:r>
         <w:br/>
@@ -1023,7 +1023,7 @@
         <w:rPr>
           <w:rStyle w:val="VerbatimChar"/>
         </w:rPr>
-        <w:t xml:space="preserve">        UH[ultrahonk-soroban-verifier]</w:t>
+        <w:t xml:space="preserve">        UH["ultrahonk-soroban-verifier"]</w:t>
       </w:r>
       <w:r>
         <w:br/>
@@ -1032,7 +1032,7 @@
         <w:rPr>
           <w:rStyle w:val="VerbatimChar"/>
         </w:rPr>
-        <w:t xml:space="preserve">        OZ[(OZ stellar-accounts&lt;br/&gt;via g2c-oz-compat shim)]</w:t>
+        <w:t xml:space="preserve">        OZ["OZ stellar-accounts&lt;br/&gt;(via g2c-oz-compat shim)"]</w:t>
       </w:r>
       <w:r>
         <w:br/>
@@ -1044,7 +1044,7 @@
         <w:rPr>
           <w:rStyle w:val="VerbatimChar"/>
         </w:rPr>
-        <w:t xml:space="preserve">        Factory -- atomic enroll --&gt; SA</w:t>
+        <w:t xml:space="preserve">        Factory --&gt;|atomic enroll| SA</w:t>
       </w:r>
       <w:r>
         <w:br/>
@@ -1053,7 +1053,7 @@
         <w:rPr>
           <w:rStyle w:val="VerbatimChar"/>
         </w:rPr>
-        <w:t xml:space="preserve">        Factory -- registers commitment --&gt; Controller</w:t>
+        <w:t xml:space="preserve">        Factory --&gt;|registers commitment| Controller</w:t>
       </w:r>
       <w:r>
         <w:br/>
@@ -1062,7 +1062,7 @@
         <w:rPr>
           <w:rStyle w:val="VerbatimChar"/>
         </w:rPr>
-        <w:t xml:space="preserve">        SA -- __check_auth --&gt; OZ</w:t>
+        <w:t xml:space="preserve">        SA --&gt;|__check_auth| OZ</w:t>
       </w:r>
       <w:r>
         <w:br/>
@@ -1071,7 +1071,7 @@
         <w:rPr>
           <w:rStyle w:val="VerbatimChar"/>
         </w:rPr>
-        <w:t xml:space="preserve">        OZ -- dispatches --&gt; Verifier</w:t>
+        <w:t xml:space="preserve">        OZ --&gt;|dispatches| Verifier</w:t>
       </w:r>
       <w:r>
         <w:br/>
@@ -1080,7 +1080,7 @@
         <w:rPr>
           <w:rStyle w:val="VerbatimChar"/>
         </w:rPr>
-        <w:t xml:space="preserve">        OZ -- enforces --&gt; Policy</w:t>
+        <w:t xml:space="preserve">        OZ --&gt;|enforces| Policy</w:t>
       </w:r>
       <w:r>
         <w:br/>
@@ -1089,7 +1089,7 @@
         <w:rPr>
           <w:rStyle w:val="VerbatimChar"/>
         </w:rPr>
-        <w:t xml:space="preserve">        Verifier -- cross-call --&gt; UH</w:t>
+        <w:t xml:space="preserve">        Verifier --&gt;|cross-call| UH</w:t>
       </w:r>
       <w:r>
         <w:br/>
@@ -1098,7 +1098,7 @@
         <w:rPr>
           <w:rStyle w:val="VerbatimChar"/>
         </w:rPr>
-        <w:t xml:space="preserve">        Policy -. reads pending state .-&gt; Controller</w:t>
+        <w:t xml:space="preserve">        Policy -.-&gt;|reads pending state| Controller</w:t>
       </w:r>
       <w:r>
         <w:br/>
@@ -1107,7 +1107,7 @@
         <w:rPr>
           <w:rStyle w:val="VerbatimChar"/>
         </w:rPr>
-        <w:t xml:space="preserve">        Controller -- inner calls&lt;br/&gt;add/remove signer --&gt; SA</w:t>
+        <w:t xml:space="preserve">        Controller --&gt;|inner calls&lt;br/&gt;add/remove signer| SA</w:t>
       </w:r>
       <w:r>
         <w:br/>
@@ -1128,7 +1128,7 @@
         <w:rPr>
           <w:rStyle w:val="VerbatimChar"/>
         </w:rPr>
-        <w:t xml:space="preserve">    Prover -. proof + auth_hash .-&gt; Verifier</w:t>
+        <w:t xml:space="preserve">    Prover -.-&gt;|proof + auth_hash| Verifier</w:t>
       </w:r>
       <w:r>
         <w:br/>
@@ -1137,7 +1137,7 @@
         <w:rPr>
           <w:rStyle w:val="VerbatimChar"/>
         </w:rPr>
-        <w:t xml:space="preserve">    OS -. Poseidon2 commitment&lt;br/&gt;at enrollment .-&gt; Controller</w:t>
+        <w:t xml:space="preserve">    OS -.-&gt;|Poseidon2 commitment&lt;br/&gt;at enrollment| Controller</w:t>
       </w:r>
     </w:p>
     <w:p>
@@ -2004,34 +2004,34 @@
         <w:br/>
       </w:r>
       <w:r>
-        <w:rPr>
-          <w:rStyle w:val="VerbatimChar"/>
-        </w:rPr>
-        <w:t xml:space="preserve">    participant WV as webauthn-verifier</w:t>
-      </w:r>
-      <w:r>
         <w:br/>
       </w:r>
       <w:r>
+        <w:rPr>
+          <w:rStyle w:val="VerbatimChar"/>
+        </w:rPr>
+        <w:t xml:space="preserve">    Submitter-&gt;&gt;RC: complete_recovery()</w:t>
+      </w:r>
+      <w:r>
         <w:br/>
       </w:r>
       <w:r>
-        <w:rPr>
-          <w:rStyle w:val="VerbatimChar"/>
-        </w:rPr>
-        <w:t xml:space="preserve">    Submitter-&gt;&gt;RC: complete_recovery()</w:t>
-      </w:r>
-      <w:r>
         <w:br/>
       </w:r>
       <w:r>
+        <w:rPr>
+          <w:rStyle w:val="VerbatimChar"/>
+        </w:rPr>
+        <w:t xml:space="preserve">    rect rgb(245, 245, 250)</w:t>
+      </w:r>
+      <w:r>
         <w:br/>
       </w:r>
       <w:r>
         <w:rPr>
           <w:rStyle w:val="VerbatimChar"/>
         </w:rPr>
-        <w:t xml:space="preserve">    rect rgb(245, 245, 250)</w:t>
+        <w:t xml:space="preserve">    Note over RC: Pre-flight checks</w:t>
       </w:r>
       <w:r>
         <w:br/>
@@ -2040,7 +2040,7 @@
         <w:rPr>
           <w:rStyle w:val="VerbatimChar"/>
         </w:rPr>
-        <w:t xml:space="preserve">    Note over RC: Pre-flight checks</w:t>
+        <w:t xml:space="preserve">    RC-&gt;&gt;RC: verify timelock expired&lt;br/&gt;(now &gt;= initiation + timelock + sum_of_pauses)</w:t>
       </w:r>
       <w:r>
         <w:br/>
@@ -2049,7 +2049,7 @@
         <w:rPr>
           <w:rStyle w:val="VerbatimChar"/>
         </w:rPr>
-        <w:t xml:space="preserve">    RC-&gt;&gt;RC: verify (now ≥ initiation_ledger&lt;br/&gt;+ timelock_duration + Σ cancel_pauses)</w:t>
+        <w:t xml:space="preserve">    RC-&gt;&gt;RC: verify deposit rent sufficient&lt;br/&gt;(else fail-closed)</w:t>
       </w:r>
       <w:r>
         <w:br/>
@@ -2058,7 +2058,7 @@
         <w:rPr>
           <w:rStyle w:val="VerbatimChar"/>
         </w:rPr>
-        <w:t xml:space="preserve">    RC-&gt;&gt;RC: verify deposit_rent_sufficient&lt;br/&gt;(else fail-closed; pending entry archives)</w:t>
+        <w:t xml:space="preserve">    RC-&gt;&gt;RC: verify ZK proof valid</w:t>
       </w:r>
       <w:r>
         <w:br/>
@@ -2067,7 +2067,7 @@
         <w:rPr>
           <w:rStyle w:val="VerbatimChar"/>
         </w:rPr>
-        <w:t xml:space="preserve">    RC-&gt;&gt;RC: verify ZK proof valid</w:t>
+        <w:t xml:space="preserve">    RC-&gt;&gt;RC: verify cancel_count &lt;= 2</w:t>
       </w:r>
       <w:r>
         <w:br/>
@@ -2076,12 +2076,78 @@
         <w:rPr>
           <w:rStyle w:val="VerbatimChar"/>
         </w:rPr>
-        <w:t xml:space="preserve">    RC-&gt;&gt;RC: verify cancel_count ≤ cap (=2)</w:t>
+        <w:t xml:space="preserve">    end</w:t>
       </w:r>
       <w:r>
         <w:br/>
       </w:r>
       <w:r>
+        <w:br/>
+      </w:r>
+      <w:r>
+        <w:rPr>
+          <w:rStyle w:val="VerbatimChar"/>
+        </w:rPr>
+        <w:t xml:space="preserve">    rect rgb(240, 250, 240)</w:t>
+      </w:r>
+      <w:r>
+        <w:br/>
+      </w:r>
+      <w:r>
+        <w:rPr>
+          <w:rStyle w:val="VerbatimChar"/>
+        </w:rPr>
+        <w:t xml:space="preserve">    Note over RC,SA: Inner call 1 - install new signer</w:t>
+      </w:r>
+      <w:r>
+        <w:br/>
+      </w:r>
+      <w:r>
+        <w:rPr>
+          <w:rStyle w:val="VerbatimChar"/>
+        </w:rPr>
+        <w:t xml:space="preserve">    RC-&gt;&gt;SA: add_signer(new_pk)</w:t>
+      </w:r>
+      <w:r>
+        <w:br/>
+      </w:r>
+      <w:r>
+        <w:rPr>
+          <w:rStyle w:val="VerbatimChar"/>
+        </w:rPr>
+        <w:t xml:space="preserve">    SA-&gt;&gt;GP: __check_auth (Default rule)</w:t>
+      </w:r>
+      <w:r>
+        <w:br/>
+      </w:r>
+      <w:r>
+        <w:rPr>
+          <w:rStyle w:val="VerbatimChar"/>
+        </w:rPr>
+        <w:t xml:space="preserve">    Note over GP: enforce reads pending state&lt;br/&gt;controller is delegated signer&lt;br/&gt;timelock_expired, proof_verified</w:t>
+      </w:r>
+      <w:r>
+        <w:br/>
+      </w:r>
+      <w:r>
+        <w:rPr>
+          <w:rStyle w:val="VerbatimChar"/>
+        </w:rPr>
+        <w:t xml:space="preserve">    GP--&gt;&gt;SA: permit</w:t>
+      </w:r>
+      <w:r>
+        <w:br/>
+      </w:r>
+      <w:r>
+        <w:rPr>
+          <w:rStyle w:val="VerbatimChar"/>
+        </w:rPr>
+        <w:t xml:space="preserve">    SA--&gt;&gt;RC: ok</w:t>
+      </w:r>
+      <w:r>
+        <w:br/>
+      </w:r>
+      <w:r>
         <w:rPr>
           <w:rStyle w:val="VerbatimChar"/>
         </w:rPr>
@@ -2097,7 +2163,7 @@
         <w:rPr>
           <w:rStyle w:val="VerbatimChar"/>
         </w:rPr>
-        <w:t xml:space="preserve">    rect rgb(240, 250, 240)</w:t>
+        <w:t xml:space="preserve">    rect rgb(250, 245, 245)</w:t>
       </w:r>
       <w:r>
         <w:br/>
@@ -2106,7 +2172,7 @@
         <w:rPr>
           <w:rStyle w:val="VerbatimChar"/>
         </w:rPr>
-        <w:t xml:space="preserve">    Note over RC,SA: Inner call 1 — install new signer</w:t>
+        <w:t xml:space="preserve">    Note over RC,SA: Inner call 2 - remove old signer</w:t>
       </w:r>
       <w:r>
         <w:br/>
@@ -2115,7 +2181,7 @@
         <w:rPr>
           <w:rStyle w:val="VerbatimChar"/>
         </w:rPr>
-        <w:t xml:space="preserve">    RC-&gt;&gt;SA: add_signer(new_pk)</w:t>
+        <w:t xml:space="preserve">    RC-&gt;&gt;SA: remove_signer(pk_old)</w:t>
       </w:r>
       <w:r>
         <w:br/>
@@ -2124,7 +2190,7 @@
         <w:rPr>
           <w:rStyle w:val="VerbatimChar"/>
         </w:rPr>
-        <w:t xml:space="preserve">    SA-&gt;&gt;GP: __check_auth&lt;br/&gt;Context = CallContract(self, add_signer)&lt;br/&gt;ContextRule = Default</w:t>
+        <w:t xml:space="preserve">    SA-&gt;&gt;GP: __check_auth (same path)</w:t>
       </w:r>
       <w:r>
         <w:br/>
@@ -2133,7 +2199,7 @@
         <w:rPr>
           <w:rStyle w:val="VerbatimChar"/>
         </w:rPr>
-        <w:t xml:space="preserve">    Note over GP: enforce(ctx, signers, …)&lt;br/&gt;reads pending_recovery_state&lt;br/&gt;sees: pending, controller is delegated signer,&lt;br/&gt;timelock_expired, proof_verified</w:t>
+        <w:t xml:space="preserve">    GP--&gt;&gt;SA: permit</w:t>
       </w:r>
       <w:r>
         <w:br/>
@@ -2142,7 +2208,7 @@
         <w:rPr>
           <w:rStyle w:val="VerbatimChar"/>
         </w:rPr>
-        <w:t xml:space="preserve">    GP--&gt;&gt;SA: permit add_signer</w:t>
+        <w:t xml:space="preserve">    SA--&gt;&gt;RC: ok</w:t>
       </w:r>
       <w:r>
         <w:br/>
@@ -2151,103 +2217,19 @@
         <w:rPr>
           <w:rStyle w:val="VerbatimChar"/>
         </w:rPr>
-        <w:t xml:space="preserve">    SA--&gt;&gt;RC: ok</w:t>
+        <w:t xml:space="preserve">    end</w:t>
       </w:r>
       <w:r>
         <w:br/>
       </w:r>
       <w:r>
-        <w:rPr>
-          <w:rStyle w:val="VerbatimChar"/>
-        </w:rPr>
-        <w:t xml:space="preserve">    end</w:t>
-      </w:r>
-      <w:r>
         <w:br/>
       </w:r>
       <w:r>
-        <w:br/>
-      </w:r>
-      <w:r>
-        <w:rPr>
-          <w:rStyle w:val="VerbatimChar"/>
-        </w:rPr>
-        <w:t xml:space="preserve">    rect rgb(250, 245, 245)</w:t>
-      </w:r>
-      <w:r>
-        <w:br/>
-      </w:r>
-      <w:r>
-        <w:rPr>
-          <w:rStyle w:val="VerbatimChar"/>
-        </w:rPr>
-        <w:t xml:space="preserve">    Note over RC,SA: Inner call 2 — remove old signer</w:t>
-      </w:r>
-      <w:r>
-        <w:br/>
-      </w:r>
-      <w:r>
-        <w:rPr>
-          <w:rStyle w:val="VerbatimChar"/>
-        </w:rPr>
-        <w:t xml:space="preserve">    RC-&gt;&gt;SA: remove_signer(pk_old)</w:t>
-      </w:r>
-      <w:r>
-        <w:br/>
-      </w:r>
-      <w:r>
-        <w:rPr>
-          <w:rStyle w:val="VerbatimChar"/>
-        </w:rPr>
-        <w:t xml:space="preserve">    SA-&gt;&gt;GP: __check_auth (same path)</w:t>
-      </w:r>
-      <w:r>
-        <w:br/>
-      </w:r>
-      <w:r>
-        <w:rPr>
-          <w:rStyle w:val="VerbatimChar"/>
-        </w:rPr>
-        <w:t xml:space="preserve">    GP--&gt;&gt;SA: permit remove_signer</w:t>
-      </w:r>
-      <w:r>
-        <w:br/>
-      </w:r>
-      <w:r>
-        <w:rPr>
-          <w:rStyle w:val="VerbatimChar"/>
-        </w:rPr>
-        <w:t xml:space="preserve">    SA--&gt;&gt;RC: ok</w:t>
-      </w:r>
-      <w:r>
-        <w:br/>
-      </w:r>
-      <w:r>
-        <w:rPr>
-          <w:rStyle w:val="VerbatimChar"/>
-        </w:rPr>
-        <w:t xml:space="preserve">    end</w:t>
-      </w:r>
-      <w:r>
-        <w:br/>
-      </w:r>
-      <w:r>
-        <w:br/>
-      </w:r>
-      <w:r>
-        <w:rPr>
-          <w:rStyle w:val="VerbatimChar"/>
-        </w:rPr>
-        <w:t xml:space="preserve">    RC-&gt;&gt;Submitter: refund deposit</w:t>
-      </w:r>
-      <w:r>
-        <w:br/>
-      </w:r>
-      <w:r>
-        <w:rPr>
-          <w:rStyle w:val="VerbatimChar"/>
-        </w:rPr>
-        <w:t xml:space="preserve">    RC-&gt;&gt;Submitter: emit RecoveryCompleted</w:t>
+        <w:rPr>
+          <w:rStyle w:val="VerbatimChar"/>
+        </w:rPr>
+        <w:t xml:space="preserve">    RC-&gt;&gt;Submitter: refund deposit + RecoveryCompleted</w:t>
       </w:r>
     </w:p>
     <w:p>

</xml_diff>